<commit_message>
Remove .env from tracking
</commit_message>
<xml_diff>
--- a/automation/outputs/chatgpt_pipeline/assignment_1/essays/docs/claude_grade_essay.docx
+++ b/automation/outputs/chatgpt_pipeline/assignment_1/essays/docs/claude_grade_essay.docx
@@ -6,41 +6,29 @@
       <w:r>
         <w:t>Critical Thinking Rubric Grading</w:t>
         <w:br/>
-        <w:t>Overall Score Calculation: Scores are assigned per category based on the rubric criteria. Total score is an average of category scores (out of 4). This essay meets minimum benchmark in most areas but lacks depth, analysis, and critical engagement, resulting in low scores. Average Score: 1.3/4 (Benchmark level overall). No zeros assigned, as it meets basic benchmark thresholds.</w:t>
+        <w:t>Overall Assessment: This submission is a very brief paragraph (essentially an anecdotal example) rather than a developed essay. It labels cat behaviors with basic learning theory terms but lacks depth, analysis, synthesis, questioning, or critical exploration. It meets the minimum Benchmark (1) threshold in most areas by stating basic ideas and citing sources (though citations are not integrated or evaluated), but shows no evidence of comprehensive critical thinking. No category reaches Milestone (2) or higher. Total score: 4/20 (1 per category; some arguably warrant 0 but meet the barest benchmark by stating an issue/position).</w:t>
         <w:br/>
-        <w:t>1. Explanation of Issues: Benchmark (1)</w:t>
+        <w:t>| Category | Score | Level &amp; Justification |</w:t>
         <w:br/>
+        <w:t>|----------|--------|-----------------------|</w:t>
         <w:br/>
-        <w:t>Issue (cats' anticipation of food via learning theories) is stated without clarification or description. Key terms (e.g., neutral stimulus, conditioned response) are named but not defined, explored, or contextualized, leaving significant gaps for full understanding.</w:t>
+        <w:t>| Explanation of issues | 1 | Benchmark (1): The issue (cats demonstrating classical, operant conditioning, and social learning via food-related behaviors) is stated but without any clarification, description, context, or exploration of ambiguities/backgrounds. No comprehensive delivery of relevant information. |</w:t>
         <w:br/>
+        <w:t>| Evidence | 1 | Benchmark (1): Sources are listed but information is presented without any interpretation, evaluation, or synthesis. Expert viewpoints (e.g., Skinner, Bandura) are taken as unquestioned fact; no analysis or questioning occurs in the text. Citations are detached and unused. |</w:t>
         <w:br/>
-        <w:t>2. Evidence (Selecting and using information to investigate a point of view or conclusion): Benchmark (1)</w:t>
+        <w:t>| Influence of context and assumptions | 0 | Zero (below Benchmark): No awareness of assumptions (own or others') or contexts is shown. Assertions (e.g., "purring and rubbing elicit feeding") are presented without labeling as assumptions or evaluating relevance. Does not meet even emerging benchmark awareness. |</w:t>
         <w:br/>
+        <w:t>| Student's position (perspective, thesis/hypothesis) | 1 | Benchmark (1): A simplistic position is stated (cats show these conditioning types via described behaviors), but it is obvious, ignores complexities/sides of the issue, and synthesizes nothing from other viewpoints. |</w:t>
         <w:br/>
-        <w:t>References are listed but information is taken from source(s) without any interpretation/evaluation. No quotes, examples, or synthesis from sources; expert viewpoints (e.g., Domjan, Bandura) are invoked implicitly as fact without questioning.</w:t>
+        <w:t>| Conclusions and related outcomes | 1 | Benchmark (1): No explicit conclusions are drawn; outcomes (e.g., "enhancing learned... behaviors") are stated simplistically and inconsistently tied to information (mostly anecdotal, not evidence-based). Oversimplified with no prioritization of evidence/perspectives. |</w:t>
         <w:br/>
+        <w:t>Recommendations for Improvement:</w:t>
         <w:br/>
-        <w:t>3. Influence of Context and Assumptions: Benchmark (1)</w:t>
+        <w:t>- Expand to a full essay with clear issue framing, integrated evidence analysis, assumption questioning, nuanced thesis, and logical conclusions.</w:t>
         <w:br/>
+        <w:t>- Use citations actively (e.g., quote/evaluate Bouton or Skinner on conditioning in cats).</w:t>
         <w:br/>
-        <w:t>Shows emerging awareness of present assumptions (e.g., cats "amplify behaviors" assumes observational learning applies directly) but does not label or analyze them. Begins to identify some contexts (e.g., multi-cat household) when presenting position, but no systematic evaluation.</w:t>
-        <w:br/>
-        <w:br/>
-        <w:t>4. Student's Position (Perspective, Thesis/Hypothesis): Benchmark (1)</w:t>
-        <w:br/>
-        <w:br/>
-        <w:t>Specific position (classical, operant, and social learning explain cat behavior) is stated but simplistic and obvious. No acknowledgment of complexities, limits, or synthesis of opposing views.</w:t>
-        <w:br/>
-        <w:br/>
-        <w:t>5. Conclusions and Related Outcomes (Implications and Consequences): Benchmark (1)</w:t>
-        <w:br/>
-        <w:br/>
-        <w:t>Conclusion (learning theories explain/amplify behaviors in cats and professor) is inconsistently tied to some information discussed; related outcomes (e.g., faster feeding via meowing) are oversimplified with no prioritization of evidence or perspectives.</w:t>
-        <w:br/>
-        <w:br/>
-        <w:t>Strengths: Clear topic statement, correct basic terminology, relevant references listed.</w:t>
-        <w:br/>
-        <w:t>Weaknesses: Lacks depth, critical analysis, questioning of sources/assumptions, or engagement with complexities. Expand with examples, source integration, counterarguments, and personal reflection for higher scores.</w:t>
+        <w:t>- Explore complexities (e.g., Is this truly operant? What assumptions about cat cognition? Counter-evidence?). Aim for Milestone (2-3) by adding some evaluation/questioning.</w:t>
       </w:r>
     </w:p>
     <w:sectPr>

</xml_diff>